<commit_message>
Implementacion de correccion de fd04
</commit_message>
<xml_diff>
--- a/Documents/FD04-EPIS-Informe Arquitectura de Software.docx
+++ b/Documents/FD04-EPIS-Informe Arquitectura de Software.docx
@@ -368,6 +368,7 @@
           <w:szCs w:val="32"/>
         </w:rPr>
       </w:pPr>
+      <w:proofErr w:type="spellStart"/>
       <w:r>
         <w:rPr>
           <w:rFonts w:ascii="Times New Roman" w:eastAsia="Times New Roman" w:hAnsi="Times New Roman" w:cs="Times New Roman"/>
@@ -375,7 +376,17 @@
           <w:sz w:val="32"/>
           <w:szCs w:val="32"/>
         </w:rPr>
-        <w:t>Mag. Patrick Cuadros Quiroga</w:t>
+        <w:t>Mag</w:t>
+      </w:r>
+      <w:proofErr w:type="spellEnd"/>
+      <w:r>
+        <w:rPr>
+          <w:rFonts w:ascii="Times New Roman" w:eastAsia="Times New Roman" w:hAnsi="Times New Roman" w:cs="Times New Roman"/>
+          <w:i/>
+          <w:sz w:val="32"/>
+          <w:szCs w:val="32"/>
+        </w:rPr>
+        <w:t>. Patrick Cuadros Quiroga</w:t>
       </w:r>
     </w:p>
     <w:p>
@@ -559,8 +570,8 @@
     </w:p>
     <w:p>
       <w:pPr>
-        <w:spacing w:after="0"/>
-        <w:jc w:val="center"/>
+        <w:spacing w:after="0" w:line="360" w:lineRule="auto"/>
+        <w:ind w:left="720"/>
         <w:rPr>
           <w:rFonts w:ascii="Times New Roman" w:eastAsia="Times New Roman" w:hAnsi="Times New Roman" w:cs="Times New Roman"/>
           <w:b/>
@@ -568,6 +579,74 @@
           <w:szCs w:val="24"/>
         </w:rPr>
       </w:pPr>
+      <w:proofErr w:type="spellStart"/>
+      <w:r>
+        <w:rPr>
+          <w:rFonts w:ascii="Times New Roman" w:eastAsia="Times New Roman" w:hAnsi="Times New Roman" w:cs="Times New Roman"/>
+          <w:i/>
+          <w:sz w:val="28"/>
+          <w:szCs w:val="28"/>
+        </w:rPr>
+        <w:t>Ancco</w:t>
+      </w:r>
+      <w:proofErr w:type="spellEnd"/>
+      <w:r>
+        <w:rPr>
+          <w:rFonts w:ascii="Times New Roman" w:eastAsia="Times New Roman" w:hAnsi="Times New Roman" w:cs="Times New Roman"/>
+          <w:i/>
+          <w:sz w:val="28"/>
+          <w:szCs w:val="28"/>
+        </w:rPr>
+        <w:t xml:space="preserve"> </w:t>
+      </w:r>
+      <w:proofErr w:type="spellStart"/>
+      <w:r>
+        <w:rPr>
+          <w:rFonts w:ascii="Times New Roman" w:eastAsia="Times New Roman" w:hAnsi="Times New Roman" w:cs="Times New Roman"/>
+          <w:i/>
+          <w:sz w:val="28"/>
+          <w:szCs w:val="28"/>
+        </w:rPr>
+        <w:t>Suaña</w:t>
+      </w:r>
+      <w:proofErr w:type="spellEnd"/>
+      <w:r>
+        <w:rPr>
+          <w:rFonts w:ascii="Times New Roman" w:eastAsia="Times New Roman" w:hAnsi="Times New Roman" w:cs="Times New Roman"/>
+          <w:i/>
+          <w:sz w:val="28"/>
+          <w:szCs w:val="28"/>
+        </w:rPr>
+        <w:t xml:space="preserve">, Bruno Enrique </w:t>
+      </w:r>
+      <w:r>
+        <w:rPr>
+          <w:rFonts w:ascii="Times New Roman" w:eastAsia="Times New Roman" w:hAnsi="Times New Roman" w:cs="Times New Roman"/>
+          <w:i/>
+          <w:sz w:val="28"/>
+          <w:szCs w:val="28"/>
+        </w:rPr>
+        <w:tab/>
+      </w:r>
+      <w:r>
+        <w:rPr>
+          <w:rFonts w:ascii="Times New Roman" w:eastAsia="Times New Roman" w:hAnsi="Times New Roman" w:cs="Times New Roman"/>
+          <w:i/>
+          <w:sz w:val="28"/>
+          <w:szCs w:val="28"/>
+        </w:rPr>
+        <w:tab/>
+      </w:r>
+      <w:r>
+        <w:rPr>
+          <w:rFonts w:ascii="Times New Roman" w:eastAsia="Times New Roman" w:hAnsi="Times New Roman" w:cs="Times New Roman"/>
+          <w:i/>
+          <w:sz w:val="28"/>
+          <w:szCs w:val="28"/>
+        </w:rPr>
+        <w:tab/>
+        <w:t>(2023077472)</w:t>
+      </w:r>
     </w:p>
     <w:p>
       <w:pPr>
@@ -1113,12 +1192,37 @@
         </w:rPr>
         <w:t xml:space="preserve">Sistema </w:t>
       </w:r>
+      <w:proofErr w:type="spellStart"/>
       <w:r>
         <w:rPr>
           <w:rFonts w:ascii="Times New Roman" w:hAnsi="Times New Roman"/>
           <w:i/>
         </w:rPr>
-        <w:t xml:space="preserve">Generador de documentación </w:t>
+        <w:t>Generador</w:t>
+      </w:r>
+      <w:proofErr w:type="spellEnd"/>
+      <w:r>
+        <w:rPr>
+          <w:rFonts w:ascii="Times New Roman" w:hAnsi="Times New Roman"/>
+          <w:i/>
+        </w:rPr>
+        <w:t xml:space="preserve"> de </w:t>
+      </w:r>
+      <w:proofErr w:type="spellStart"/>
+      <w:r>
+        <w:rPr>
+          <w:rFonts w:ascii="Times New Roman" w:hAnsi="Times New Roman"/>
+          <w:i/>
+        </w:rPr>
+        <w:t>documentación</w:t>
+      </w:r>
+      <w:proofErr w:type="spellEnd"/>
+      <w:r>
+        <w:rPr>
+          <w:rFonts w:ascii="Times New Roman" w:hAnsi="Times New Roman"/>
+          <w:i/>
+        </w:rPr>
+        <w:t xml:space="preserve"> </w:t>
       </w:r>
     </w:p>
     <w:p>
@@ -4475,7 +4579,29 @@
           <w:sz w:val="20"/>
           <w:szCs w:val="20"/>
         </w:rPr>
-        <w:t>[El documento se centrará en el desarrollo de la vista lógica del framework. Se incluyen los aspectos fundamentales del resto de las vistas y se omiten aquellas que no se consideren pertinentes como ser el caso de la vista de procesos.]</w:t>
+        <w:t xml:space="preserve">[El documento se centrará en el desarrollo de la vista lógica del </w:t>
+      </w:r>
+      <w:proofErr w:type="spellStart"/>
+      <w:r>
+        <w:rPr>
+          <w:rFonts w:ascii="Times New Roman" w:eastAsia="Times New Roman" w:hAnsi="Times New Roman" w:cs="Times New Roman"/>
+          <w:i/>
+          <w:color w:val="0000FF"/>
+          <w:sz w:val="20"/>
+          <w:szCs w:val="20"/>
+        </w:rPr>
+        <w:t>framework</w:t>
+      </w:r>
+      <w:proofErr w:type="spellEnd"/>
+      <w:r>
+        <w:rPr>
+          <w:rFonts w:ascii="Times New Roman" w:eastAsia="Times New Roman" w:hAnsi="Times New Roman" w:cs="Times New Roman"/>
+          <w:i/>
+          <w:color w:val="0000FF"/>
+          <w:sz w:val="20"/>
+          <w:szCs w:val="20"/>
+        </w:rPr>
+        <w:t>. Se incluyen los aspectos fundamentales del resto de las vistas y se omiten aquellas que no se consideren pertinentes como ser el caso de la vista de procesos.]</w:t>
       </w:r>
     </w:p>
     <w:p>
@@ -4555,7 +4681,15 @@
         <w:jc w:val="both"/>
       </w:pPr>
       <w:r>
-        <w:t>Integración de varias IAs para procesar y generar contenido por secciones.</w:t>
+        <w:t xml:space="preserve">Integración de varias </w:t>
+      </w:r>
+      <w:proofErr w:type="spellStart"/>
+      <w:r>
+        <w:t>IAs</w:t>
+      </w:r>
+      <w:proofErr w:type="spellEnd"/>
+      <w:r>
+        <w:t xml:space="preserve"> para procesar y generar contenido por secciones.</w:t>
       </w:r>
     </w:p>
     <w:p>
@@ -5294,6 +5428,7 @@
                 <w:szCs w:val="20"/>
               </w:rPr>
             </w:pPr>
+            <w:proofErr w:type="spellStart"/>
             <w:r>
               <w:rPr>
                 <w:rFonts w:ascii="Times New Roman" w:eastAsia="Times New Roman" w:hAnsi="Times New Roman" w:cs="Times New Roman"/>
@@ -5302,7 +5437,18 @@
                 <w:sz w:val="20"/>
                 <w:szCs w:val="20"/>
               </w:rPr>
-              <w:t xml:space="preserve">Descripcion </w:t>
+              <w:t>Descripcion</w:t>
+            </w:r>
+            <w:proofErr w:type="spellEnd"/>
+            <w:r>
+              <w:rPr>
+                <w:rFonts w:ascii="Times New Roman" w:eastAsia="Times New Roman" w:hAnsi="Times New Roman" w:cs="Times New Roman"/>
+                <w:i/>
+                <w:color w:val="0000FF"/>
+                <w:sz w:val="20"/>
+                <w:szCs w:val="20"/>
+              </w:rPr>
+              <w:t xml:space="preserve"> </w:t>
             </w:r>
           </w:p>
         </w:tc>
@@ -5362,9 +5508,11 @@
                 <w:szCs w:val="20"/>
               </w:rPr>
             </w:pPr>
+            <w:proofErr w:type="spellStart"/>
             <w:r>
               <w:t>RegistroUsuario</w:t>
             </w:r>
+            <w:proofErr w:type="spellEnd"/>
           </w:p>
         </w:tc>
         <w:tc>
@@ -5395,7 +5543,15 @@
               </w:rPr>
             </w:pPr>
             <w:r>
-              <w:t>El sistema web debe permitir la creacion de cuentas a los usuario nuevos</w:t>
+              <w:t xml:space="preserve">El sistema web debe permitir la </w:t>
+            </w:r>
+            <w:proofErr w:type="spellStart"/>
+            <w:r>
+              <w:t>creacion</w:t>
+            </w:r>
+            <w:proofErr w:type="spellEnd"/>
+            <w:r>
+              <w:t xml:space="preserve"> de cuentas a los usuario nuevos</w:t>
             </w:r>
           </w:p>
         </w:tc>
@@ -5460,9 +5616,11 @@
                 <w:szCs w:val="20"/>
               </w:rPr>
             </w:pPr>
+            <w:proofErr w:type="spellStart"/>
             <w:r>
               <w:t>RegistroAdmin</w:t>
             </w:r>
+            <w:proofErr w:type="spellEnd"/>
           </w:p>
         </w:tc>
         <w:tc>
@@ -5493,7 +5651,15 @@
               </w:rPr>
             </w:pPr>
             <w:r>
-              <w:t>El sistema web debe permitir la creacion de cuentas para administrador</w:t>
+              <w:t xml:space="preserve">El sistema web debe permitir la </w:t>
+            </w:r>
+            <w:proofErr w:type="spellStart"/>
+            <w:r>
+              <w:t>creacion</w:t>
+            </w:r>
+            <w:proofErr w:type="spellEnd"/>
+            <w:r>
+              <w:t xml:space="preserve"> de cuentas para administrador</w:t>
             </w:r>
           </w:p>
         </w:tc>
@@ -5558,9 +5724,11 @@
                 <w:szCs w:val="20"/>
               </w:rPr>
             </w:pPr>
+            <w:proofErr w:type="spellStart"/>
             <w:r>
               <w:t>ModuloInput</w:t>
             </w:r>
+            <w:proofErr w:type="spellEnd"/>
           </w:p>
         </w:tc>
         <w:tc>
@@ -5591,7 +5759,23 @@
               </w:rPr>
             </w:pPr>
             <w:r>
-              <w:t>El sistema web debe tener un modulo para introducir la informacion clave dependiendo del formato escogido</w:t>
+              <w:t xml:space="preserve">El sistema web debe tener un </w:t>
+            </w:r>
+            <w:proofErr w:type="spellStart"/>
+            <w:r>
+              <w:t>modulo</w:t>
+            </w:r>
+            <w:proofErr w:type="spellEnd"/>
+            <w:r>
+              <w:t xml:space="preserve"> para introducir la </w:t>
+            </w:r>
+            <w:proofErr w:type="spellStart"/>
+            <w:r>
+              <w:t>informacion</w:t>
+            </w:r>
+            <w:proofErr w:type="spellEnd"/>
+            <w:r>
+              <w:t xml:space="preserve"> clave dependiendo del formato escogido</w:t>
             </w:r>
           </w:p>
         </w:tc>
@@ -5656,9 +5840,11 @@
                 <w:szCs w:val="20"/>
               </w:rPr>
             </w:pPr>
+            <w:proofErr w:type="spellStart"/>
             <w:r>
               <w:t>SeleccionFormato</w:t>
             </w:r>
+            <w:proofErr w:type="spellEnd"/>
           </w:p>
         </w:tc>
         <w:tc>
@@ -5689,7 +5875,15 @@
               </w:rPr>
             </w:pPr>
             <w:r>
-              <w:t>El sistema web debe permitir la seleccion del formato estandarizado para iniciar un nuevo documento</w:t>
+              <w:t xml:space="preserve">El sistema web debe permitir la </w:t>
+            </w:r>
+            <w:proofErr w:type="spellStart"/>
+            <w:r>
+              <w:t>seleccion</w:t>
+            </w:r>
+            <w:proofErr w:type="spellEnd"/>
+            <w:r>
+              <w:t xml:space="preserve"> del formato estandarizado para iniciar un nuevo documento</w:t>
             </w:r>
           </w:p>
         </w:tc>
@@ -5754,9 +5948,11 @@
                 <w:szCs w:val="20"/>
               </w:rPr>
             </w:pPr>
+            <w:proofErr w:type="spellStart"/>
             <w:r>
               <w:t>MultiIdioma</w:t>
             </w:r>
+            <w:proofErr w:type="spellEnd"/>
           </w:p>
         </w:tc>
         <w:tc>
@@ -5852,9 +6048,11 @@
                 <w:szCs w:val="20"/>
               </w:rPr>
             </w:pPr>
+            <w:proofErr w:type="spellStart"/>
             <w:r>
               <w:t>ModelosIA</w:t>
             </w:r>
+            <w:proofErr w:type="spellEnd"/>
           </w:p>
         </w:tc>
         <w:tc>
@@ -5954,9 +6152,11 @@
                 <w:szCs w:val="20"/>
               </w:rPr>
             </w:pPr>
+            <w:proofErr w:type="spellStart"/>
             <w:r>
               <w:t>GenerarPDF</w:t>
             </w:r>
+            <w:proofErr w:type="spellEnd"/>
           </w:p>
         </w:tc>
         <w:tc>
@@ -5987,7 +6187,15 @@
               </w:rPr>
             </w:pPr>
             <w:r>
-              <w:t>El sistema web debe permitir la generacion documentos completos en formatos PDF siguiendo los formatos establecidos.</w:t>
+              <w:t xml:space="preserve">El sistema web debe permitir la </w:t>
+            </w:r>
+            <w:proofErr w:type="spellStart"/>
+            <w:r>
+              <w:t>generacion</w:t>
+            </w:r>
+            <w:proofErr w:type="spellEnd"/>
+            <w:r>
+              <w:t xml:space="preserve"> documentos completos en formatos PDF siguiendo los formatos establecidos.</w:t>
             </w:r>
           </w:p>
         </w:tc>
@@ -6052,9 +6260,11 @@
                 <w:szCs w:val="20"/>
               </w:rPr>
             </w:pPr>
+            <w:proofErr w:type="spellStart"/>
             <w:r>
               <w:t>DescargaInmediata</w:t>
             </w:r>
+            <w:proofErr w:type="spellEnd"/>
           </w:p>
         </w:tc>
         <w:tc>
@@ -6085,8 +6295,13 @@
               </w:rPr>
             </w:pPr>
             <w:r>
-              <w:t>El sistema web debe permitir la descarga del documento en el momento de su generacion</w:t>
-            </w:r>
+              <w:t xml:space="preserve">El sistema web debe permitir la descarga del documento en el momento de su </w:t>
+            </w:r>
+            <w:proofErr w:type="spellStart"/>
+            <w:r>
+              <w:t>generacion</w:t>
+            </w:r>
+            <w:proofErr w:type="spellEnd"/>
           </w:p>
         </w:tc>
         <w:tc>
@@ -6150,9 +6365,11 @@
                 <w:szCs w:val="20"/>
               </w:rPr>
             </w:pPr>
+            <w:proofErr w:type="spellStart"/>
             <w:r>
               <w:t>GenerarCitas</w:t>
             </w:r>
+            <w:proofErr w:type="spellEnd"/>
           </w:p>
         </w:tc>
         <w:tc>
@@ -6185,9 +6402,38 @@
             <w:r>
               <w:t xml:space="preserve">El sistema web debe generar las citas y </w:t>
             </w:r>
+            <w:proofErr w:type="spellStart"/>
             <w:r>
               <w:lastRenderedPageBreak/>
-              <w:t>bibliografia automaticamente segun el contenido extraidas de fuentes reales dependiendo del formato escogido</w:t>
+              <w:t>bibliografia</w:t>
+            </w:r>
+            <w:proofErr w:type="spellEnd"/>
+            <w:r>
+              <w:t xml:space="preserve"> </w:t>
+            </w:r>
+            <w:proofErr w:type="spellStart"/>
+            <w:r>
+              <w:t>automaticamente</w:t>
+            </w:r>
+            <w:proofErr w:type="spellEnd"/>
+            <w:r>
+              <w:t xml:space="preserve"> </w:t>
+            </w:r>
+            <w:proofErr w:type="spellStart"/>
+            <w:r>
+              <w:t>segun</w:t>
+            </w:r>
+            <w:proofErr w:type="spellEnd"/>
+            <w:r>
+              <w:t xml:space="preserve"> el contenido </w:t>
+            </w:r>
+            <w:proofErr w:type="spellStart"/>
+            <w:r>
+              <w:t>extraidas</w:t>
+            </w:r>
+            <w:proofErr w:type="spellEnd"/>
+            <w:r>
+              <w:t xml:space="preserve"> de fuentes reales dependiendo del formato escogido</w:t>
             </w:r>
           </w:p>
         </w:tc>
@@ -6253,9 +6499,11 @@
                 <w:szCs w:val="20"/>
               </w:rPr>
             </w:pPr>
+            <w:proofErr w:type="spellStart"/>
             <w:r>
               <w:t>HistorialDocs</w:t>
             </w:r>
+            <w:proofErr w:type="spellEnd"/>
           </w:p>
         </w:tc>
         <w:tc>
@@ -6351,9 +6599,11 @@
                 <w:szCs w:val="20"/>
               </w:rPr>
             </w:pPr>
+            <w:proofErr w:type="spellStart"/>
             <w:r>
               <w:t>DescargaHistorial</w:t>
             </w:r>
+            <w:proofErr w:type="spellEnd"/>
           </w:p>
         </w:tc>
         <w:tc>
@@ -6451,8 +6701,13 @@
               </w:rPr>
             </w:pPr>
             <w:r>
-              <w:t>Debe integrar Login</w:t>
-            </w:r>
+              <w:t xml:space="preserve">Debe integrar </w:t>
+            </w:r>
+            <w:proofErr w:type="spellStart"/>
+            <w:r>
+              <w:t>Login</w:t>
+            </w:r>
+            <w:proofErr w:type="spellEnd"/>
           </w:p>
         </w:tc>
         <w:tc>
@@ -7218,7 +7473,25 @@
                 <w:sz w:val="20"/>
                 <w:szCs w:val="20"/>
               </w:rPr>
-              <w:t>El diseño debe adaptarse correctamente a distintos tamaños de pantalla (teléfono, tablet, laptop, escritorio).</w:t>
+              <w:t xml:space="preserve">El diseño debe adaptarse correctamente a distintos tamaños de pantalla (teléfono, </w:t>
+            </w:r>
+            <w:proofErr w:type="spellStart"/>
+            <w:r>
+              <w:rPr>
+                <w:rFonts w:ascii="Arial" w:eastAsia="Arial" w:hAnsi="Arial" w:cs="Arial"/>
+                <w:sz w:val="20"/>
+                <w:szCs w:val="20"/>
+              </w:rPr>
+              <w:t>tablet</w:t>
+            </w:r>
+            <w:proofErr w:type="spellEnd"/>
+            <w:r>
+              <w:rPr>
+                <w:rFonts w:ascii="Arial" w:eastAsia="Arial" w:hAnsi="Arial" w:cs="Arial"/>
+                <w:sz w:val="20"/>
+                <w:szCs w:val="20"/>
+              </w:rPr>
+              <w:t>, laptop, escritorio).</w:t>
             </w:r>
           </w:p>
         </w:tc>
@@ -7380,6 +7653,7 @@
                 <w:szCs w:val="20"/>
               </w:rPr>
             </w:pPr>
+            <w:proofErr w:type="spellStart"/>
             <w:r>
               <w:rPr>
                 <w:rFonts w:ascii="Times New Roman" w:eastAsia="Times New Roman" w:hAnsi="Times New Roman" w:cs="Times New Roman"/>
@@ -7388,7 +7662,18 @@
                 <w:sz w:val="20"/>
                 <w:szCs w:val="20"/>
               </w:rPr>
-              <w:t xml:space="preserve">Descripcion </w:t>
+              <w:t>Descripcion</w:t>
+            </w:r>
+            <w:proofErr w:type="spellEnd"/>
+            <w:r>
+              <w:rPr>
+                <w:rFonts w:ascii="Times New Roman" w:eastAsia="Times New Roman" w:hAnsi="Times New Roman" w:cs="Times New Roman"/>
+                <w:i/>
+                <w:color w:val="0000FF"/>
+                <w:sz w:val="20"/>
+                <w:szCs w:val="20"/>
+              </w:rPr>
+              <w:t xml:space="preserve"> </w:t>
             </w:r>
           </w:p>
         </w:tc>
@@ -7448,9 +7733,11 @@
                 <w:szCs w:val="20"/>
               </w:rPr>
             </w:pPr>
+            <w:proofErr w:type="spellStart"/>
             <w:r>
               <w:t>RegistroUsuario</w:t>
             </w:r>
+            <w:proofErr w:type="spellEnd"/>
           </w:p>
         </w:tc>
         <w:tc>
@@ -7481,7 +7768,15 @@
               </w:rPr>
             </w:pPr>
             <w:r>
-              <w:t>El sistema web debe permitir la creacion de cuentas a los usuario nuevos</w:t>
+              <w:t xml:space="preserve">El sistema web debe permitir la </w:t>
+            </w:r>
+            <w:proofErr w:type="spellStart"/>
+            <w:r>
+              <w:t>creacion</w:t>
+            </w:r>
+            <w:proofErr w:type="spellEnd"/>
+            <w:r>
+              <w:t xml:space="preserve"> de cuentas a los usuario nuevos</w:t>
             </w:r>
           </w:p>
         </w:tc>
@@ -7546,9 +7841,11 @@
                 <w:szCs w:val="20"/>
               </w:rPr>
             </w:pPr>
+            <w:proofErr w:type="spellStart"/>
             <w:r>
               <w:t>RegistroAdmin</w:t>
             </w:r>
+            <w:proofErr w:type="spellEnd"/>
           </w:p>
         </w:tc>
         <w:tc>
@@ -7579,7 +7876,15 @@
               </w:rPr>
             </w:pPr>
             <w:r>
-              <w:t>El sistema web debe permitir la creacion de cuentas para administrador</w:t>
+              <w:t xml:space="preserve">El sistema web debe permitir la </w:t>
+            </w:r>
+            <w:proofErr w:type="spellStart"/>
+            <w:r>
+              <w:t>creacion</w:t>
+            </w:r>
+            <w:proofErr w:type="spellEnd"/>
+            <w:r>
+              <w:t xml:space="preserve"> de cuentas para administrador</w:t>
             </w:r>
           </w:p>
         </w:tc>
@@ -7644,9 +7949,11 @@
                 <w:szCs w:val="20"/>
               </w:rPr>
             </w:pPr>
+            <w:proofErr w:type="spellStart"/>
             <w:r>
               <w:t>ModuloInput</w:t>
             </w:r>
+            <w:proofErr w:type="spellEnd"/>
           </w:p>
         </w:tc>
         <w:tc>
@@ -7677,7 +7984,23 @@
               </w:rPr>
             </w:pPr>
             <w:r>
-              <w:t>El sistema web debe tener un modulo para introducir la informacion clave dependiendo del formato escogido</w:t>
+              <w:t xml:space="preserve">El sistema web debe tener un </w:t>
+            </w:r>
+            <w:proofErr w:type="spellStart"/>
+            <w:r>
+              <w:t>modulo</w:t>
+            </w:r>
+            <w:proofErr w:type="spellEnd"/>
+            <w:r>
+              <w:t xml:space="preserve"> para introducir la </w:t>
+            </w:r>
+            <w:proofErr w:type="spellStart"/>
+            <w:r>
+              <w:t>informacion</w:t>
+            </w:r>
+            <w:proofErr w:type="spellEnd"/>
+            <w:r>
+              <w:t xml:space="preserve"> clave dependiendo del formato escogido</w:t>
             </w:r>
           </w:p>
         </w:tc>
@@ -7742,9 +8065,11 @@
                 <w:szCs w:val="20"/>
               </w:rPr>
             </w:pPr>
+            <w:proofErr w:type="spellStart"/>
             <w:r>
               <w:t>SeleccionFormato</w:t>
             </w:r>
+            <w:proofErr w:type="spellEnd"/>
           </w:p>
         </w:tc>
         <w:tc>
@@ -7775,7 +8100,15 @@
               </w:rPr>
             </w:pPr>
             <w:r>
-              <w:t>El sistema web debe permitir la seleccion del formato estandarizado para iniciar un nuevo documento</w:t>
+              <w:t xml:space="preserve">El sistema web debe permitir la </w:t>
+            </w:r>
+            <w:proofErr w:type="spellStart"/>
+            <w:r>
+              <w:t>seleccion</w:t>
+            </w:r>
+            <w:proofErr w:type="spellEnd"/>
+            <w:r>
+              <w:t xml:space="preserve"> del formato estandarizado para iniciar un nuevo documento</w:t>
             </w:r>
           </w:p>
         </w:tc>
@@ -7840,9 +8173,11 @@
                 <w:szCs w:val="20"/>
               </w:rPr>
             </w:pPr>
+            <w:proofErr w:type="spellStart"/>
             <w:r>
               <w:t>MultiIdioma</w:t>
             </w:r>
+            <w:proofErr w:type="spellEnd"/>
           </w:p>
         </w:tc>
         <w:tc>
@@ -7938,9 +8273,11 @@
                 <w:szCs w:val="20"/>
               </w:rPr>
             </w:pPr>
+            <w:proofErr w:type="spellStart"/>
             <w:r>
               <w:t>ModelosIA</w:t>
             </w:r>
+            <w:proofErr w:type="spellEnd"/>
           </w:p>
         </w:tc>
         <w:tc>
@@ -8040,9 +8377,11 @@
                 <w:szCs w:val="20"/>
               </w:rPr>
             </w:pPr>
+            <w:proofErr w:type="spellStart"/>
             <w:r>
               <w:t>GenerarPDF</w:t>
             </w:r>
+            <w:proofErr w:type="spellEnd"/>
           </w:p>
         </w:tc>
         <w:tc>
@@ -8073,7 +8412,15 @@
               </w:rPr>
             </w:pPr>
             <w:r>
-              <w:t>El sistema web debe permitir la generacion documentos completos en formatos PDF siguiendo los formatos establecidos.</w:t>
+              <w:t xml:space="preserve">El sistema web debe permitir la </w:t>
+            </w:r>
+            <w:proofErr w:type="spellStart"/>
+            <w:r>
+              <w:t>generacion</w:t>
+            </w:r>
+            <w:proofErr w:type="spellEnd"/>
+            <w:r>
+              <w:t xml:space="preserve"> documentos completos en formatos PDF siguiendo los formatos establecidos.</w:t>
             </w:r>
           </w:p>
         </w:tc>
@@ -8138,9 +8485,11 @@
                 <w:szCs w:val="20"/>
               </w:rPr>
             </w:pPr>
+            <w:proofErr w:type="spellStart"/>
             <w:r>
               <w:t>DescargaInmediata</w:t>
             </w:r>
+            <w:proofErr w:type="spellEnd"/>
           </w:p>
         </w:tc>
         <w:tc>
@@ -8171,8 +8520,13 @@
               </w:rPr>
             </w:pPr>
             <w:r>
-              <w:t>El sistema web debe permitir la descarga del documento en el momento de su generacion</w:t>
-            </w:r>
+              <w:t xml:space="preserve">El sistema web debe permitir la descarga del documento en el momento de su </w:t>
+            </w:r>
+            <w:proofErr w:type="spellStart"/>
+            <w:r>
+              <w:t>generacion</w:t>
+            </w:r>
+            <w:proofErr w:type="spellEnd"/>
           </w:p>
         </w:tc>
         <w:tc>
@@ -8236,9 +8590,11 @@
                 <w:szCs w:val="20"/>
               </w:rPr>
             </w:pPr>
+            <w:proofErr w:type="spellStart"/>
             <w:r>
               <w:t>GenerarCitas</w:t>
             </w:r>
+            <w:proofErr w:type="spellEnd"/>
           </w:p>
         </w:tc>
         <w:tc>
@@ -8269,7 +8625,39 @@
               </w:rPr>
             </w:pPr>
             <w:r>
-              <w:t>El sistema web debe generar las citas y bibliografia automaticamente segun el contenido extraidas de fuentes reales dependiendo del formato escogido</w:t>
+              <w:t xml:space="preserve">El sistema web debe generar las citas y </w:t>
+            </w:r>
+            <w:proofErr w:type="spellStart"/>
+            <w:r>
+              <w:t>bibliografia</w:t>
+            </w:r>
+            <w:proofErr w:type="spellEnd"/>
+            <w:r>
+              <w:t xml:space="preserve"> </w:t>
+            </w:r>
+            <w:proofErr w:type="spellStart"/>
+            <w:r>
+              <w:t>automaticamente</w:t>
+            </w:r>
+            <w:proofErr w:type="spellEnd"/>
+            <w:r>
+              <w:t xml:space="preserve"> </w:t>
+            </w:r>
+            <w:proofErr w:type="spellStart"/>
+            <w:r>
+              <w:t>segun</w:t>
+            </w:r>
+            <w:proofErr w:type="spellEnd"/>
+            <w:r>
+              <w:t xml:space="preserve"> el contenido </w:t>
+            </w:r>
+            <w:proofErr w:type="spellStart"/>
+            <w:r>
+              <w:t>extraidas</w:t>
+            </w:r>
+            <w:proofErr w:type="spellEnd"/>
+            <w:r>
+              <w:t xml:space="preserve"> de fuentes reales dependiendo del formato escogido</w:t>
             </w:r>
           </w:p>
         </w:tc>
@@ -8334,9 +8722,11 @@
                 <w:szCs w:val="20"/>
               </w:rPr>
             </w:pPr>
+            <w:proofErr w:type="spellStart"/>
             <w:r>
               <w:t>HistorialDocs</w:t>
             </w:r>
+            <w:proofErr w:type="spellEnd"/>
           </w:p>
         </w:tc>
         <w:tc>
@@ -8432,9 +8822,11 @@
                 <w:szCs w:val="20"/>
               </w:rPr>
             </w:pPr>
+            <w:proofErr w:type="spellStart"/>
             <w:r>
               <w:t>DescargaHistorial</w:t>
             </w:r>
+            <w:proofErr w:type="spellEnd"/>
           </w:p>
         </w:tc>
         <w:tc>
@@ -8609,6 +9001,7 @@
                 <w:szCs w:val="20"/>
               </w:rPr>
             </w:pPr>
+            <w:proofErr w:type="spellStart"/>
             <w:r>
               <w:rPr>
                 <w:rFonts w:ascii="Times New Roman" w:eastAsia="Times New Roman" w:hAnsi="Times New Roman" w:cs="Times New Roman"/>
@@ -8617,7 +9010,18 @@
                 <w:sz w:val="20"/>
                 <w:szCs w:val="20"/>
               </w:rPr>
-              <w:t xml:space="preserve">Descripcion </w:t>
+              <w:t>Descripcion</w:t>
+            </w:r>
+            <w:proofErr w:type="spellEnd"/>
+            <w:r>
+              <w:rPr>
+                <w:rFonts w:ascii="Times New Roman" w:eastAsia="Times New Roman" w:hAnsi="Times New Roman" w:cs="Times New Roman"/>
+                <w:i/>
+                <w:color w:val="0000FF"/>
+                <w:sz w:val="20"/>
+                <w:szCs w:val="20"/>
+              </w:rPr>
+              <w:t xml:space="preserve"> </w:t>
             </w:r>
           </w:p>
         </w:tc>
@@ -8679,8 +9083,13 @@
               </w:rPr>
             </w:pPr>
             <w:r>
-              <w:t>Debe integrar Login</w:t>
-            </w:r>
+              <w:t xml:space="preserve">Debe integrar </w:t>
+            </w:r>
+            <w:proofErr w:type="spellStart"/>
+            <w:r>
+              <w:t>Login</w:t>
+            </w:r>
+            <w:proofErr w:type="spellEnd"/>
           </w:p>
         </w:tc>
         <w:tc>
@@ -9466,7 +9875,25 @@
                 <w:sz w:val="20"/>
                 <w:szCs w:val="20"/>
               </w:rPr>
-              <w:t>El diseño debe adaptarse correctamente a distintos tamaños de pantalla (teléfono, tablet, laptop, escritorio).</w:t>
+              <w:t xml:space="preserve">El diseño debe adaptarse correctamente a distintos tamaños de pantalla (teléfono, </w:t>
+            </w:r>
+            <w:proofErr w:type="spellStart"/>
+            <w:r>
+              <w:rPr>
+                <w:rFonts w:ascii="Arial" w:eastAsia="Arial" w:hAnsi="Arial" w:cs="Arial"/>
+                <w:sz w:val="20"/>
+                <w:szCs w:val="20"/>
+              </w:rPr>
+              <w:t>tablet</w:t>
+            </w:r>
+            <w:proofErr w:type="spellEnd"/>
+            <w:r>
+              <w:rPr>
+                <w:rFonts w:ascii="Arial" w:eastAsia="Arial" w:hAnsi="Arial" w:cs="Arial"/>
+                <w:sz w:val="20"/>
+                <w:szCs w:val="20"/>
+              </w:rPr>
+              <w:t>, laptop, escritorio).</w:t>
             </w:r>
           </w:p>
         </w:tc>
@@ -9533,14 +9960,10 @@
           <w:sz w:val="20"/>
           <w:szCs w:val="20"/>
         </w:rPr>
-        <w:t>[Los Atributos de Calidad (QAs) son propiedades medibles y evaluables de un sistema, estas propiedades son usadas para indicar el grado en que el sistema satisface las necesidades de los stakeholders   [Wojcik  2013].</w:t>
-      </w:r>
-    </w:p>
-    <w:p>
-      <w:pPr>
-        <w:spacing w:after="0" w:line="240" w:lineRule="auto"/>
-        <w:ind w:left="360"/>
-        <w:jc w:val="both"/>
+        <w:t>[Los Atributos de Calidad (</w:t>
+      </w:r>
+      <w:proofErr w:type="spellStart"/>
+      <w:r>
         <w:rPr>
           <w:rFonts w:ascii="Times New Roman" w:eastAsia="Times New Roman" w:hAnsi="Times New Roman" w:cs="Times New Roman"/>
           <w:i/>
@@ -9548,7 +9971,9 @@
           <w:sz w:val="20"/>
           <w:szCs w:val="20"/>
         </w:rPr>
-      </w:pPr>
+        <w:t>QAs</w:t>
+      </w:r>
+      <w:proofErr w:type="spellEnd"/>
       <w:r>
         <w:rPr>
           <w:rFonts w:ascii="Times New Roman" w:eastAsia="Times New Roman" w:hAnsi="Times New Roman" w:cs="Times New Roman"/>
@@ -9557,7 +9982,141 @@
           <w:sz w:val="20"/>
           <w:szCs w:val="20"/>
         </w:rPr>
-        <w:t xml:space="preserve">Los QAs además son concebidos como aquellos requerimientos que no son funcionales. De hecho, la funcionalidad es mayormente ortogonal a los QAs; un diseño puede cumplir con la funcionalidad deseada y fallar a la hora de satisfacer sus requerimientos de calidad. De esta manera, se entiende a la funcionalidad como la capacidad del sistema para hacer el trabajo para el cual fue pensado, independientemente de la estructura. Existen QAs mayormente usados que se suelen identificar en numerosos sistemas y se tienen que describir, aunque la lista no es fina ya que muy a menudo hay situaciones en que podrían identificarse y proponerse nuevas propiedades para las diversas necesidades de stakeholders.] </w:t>
+        <w:t xml:space="preserve">) son propiedades medibles y evaluables de un sistema, estas propiedades son usadas para indicar el grado en que el sistema satisface las necesidades de los </w:t>
+      </w:r>
+      <w:proofErr w:type="spellStart"/>
+      <w:r>
+        <w:rPr>
+          <w:rFonts w:ascii="Times New Roman" w:eastAsia="Times New Roman" w:hAnsi="Times New Roman" w:cs="Times New Roman"/>
+          <w:i/>
+          <w:color w:val="0000FF"/>
+          <w:sz w:val="20"/>
+          <w:szCs w:val="20"/>
+        </w:rPr>
+        <w:t>stakeholders</w:t>
+      </w:r>
+      <w:proofErr w:type="spellEnd"/>
+      <w:r>
+        <w:rPr>
+          <w:rFonts w:ascii="Times New Roman" w:eastAsia="Times New Roman" w:hAnsi="Times New Roman" w:cs="Times New Roman"/>
+          <w:i/>
+          <w:color w:val="0000FF"/>
+          <w:sz w:val="20"/>
+          <w:szCs w:val="20"/>
+        </w:rPr>
+        <w:t xml:space="preserve">   [</w:t>
+      </w:r>
+      <w:proofErr w:type="spellStart"/>
+      <w:r>
+        <w:rPr>
+          <w:rFonts w:ascii="Times New Roman" w:eastAsia="Times New Roman" w:hAnsi="Times New Roman" w:cs="Times New Roman"/>
+          <w:i/>
+          <w:color w:val="0000FF"/>
+          <w:sz w:val="20"/>
+          <w:szCs w:val="20"/>
+        </w:rPr>
+        <w:t>Wojcik</w:t>
+      </w:r>
+      <w:proofErr w:type="spellEnd"/>
+      <w:r>
+        <w:rPr>
+          <w:rFonts w:ascii="Times New Roman" w:eastAsia="Times New Roman" w:hAnsi="Times New Roman" w:cs="Times New Roman"/>
+          <w:i/>
+          <w:color w:val="0000FF"/>
+          <w:sz w:val="20"/>
+          <w:szCs w:val="20"/>
+        </w:rPr>
+        <w:t xml:space="preserve">  2013].</w:t>
+      </w:r>
+    </w:p>
+    <w:p>
+      <w:pPr>
+        <w:spacing w:after="0" w:line="240" w:lineRule="auto"/>
+        <w:ind w:left="360"/>
+        <w:jc w:val="both"/>
+        <w:rPr>
+          <w:rFonts w:ascii="Times New Roman" w:eastAsia="Times New Roman" w:hAnsi="Times New Roman" w:cs="Times New Roman"/>
+          <w:i/>
+          <w:color w:val="0000FF"/>
+          <w:sz w:val="20"/>
+          <w:szCs w:val="20"/>
+        </w:rPr>
+      </w:pPr>
+      <w:r>
+        <w:rPr>
+          <w:rFonts w:ascii="Times New Roman" w:eastAsia="Times New Roman" w:hAnsi="Times New Roman" w:cs="Times New Roman"/>
+          <w:i/>
+          <w:color w:val="0000FF"/>
+          <w:sz w:val="20"/>
+          <w:szCs w:val="20"/>
+        </w:rPr>
+        <w:t xml:space="preserve">Los </w:t>
+      </w:r>
+      <w:proofErr w:type="spellStart"/>
+      <w:r>
+        <w:rPr>
+          <w:rFonts w:ascii="Times New Roman" w:eastAsia="Times New Roman" w:hAnsi="Times New Roman" w:cs="Times New Roman"/>
+          <w:i/>
+          <w:color w:val="0000FF"/>
+          <w:sz w:val="20"/>
+          <w:szCs w:val="20"/>
+        </w:rPr>
+        <w:t>QAs</w:t>
+      </w:r>
+      <w:proofErr w:type="spellEnd"/>
+      <w:r>
+        <w:rPr>
+          <w:rFonts w:ascii="Times New Roman" w:eastAsia="Times New Roman" w:hAnsi="Times New Roman" w:cs="Times New Roman"/>
+          <w:i/>
+          <w:color w:val="0000FF"/>
+          <w:sz w:val="20"/>
+          <w:szCs w:val="20"/>
+        </w:rPr>
+        <w:t xml:space="preserve"> además son concebidos como aquellos requerimientos que no son funcionales. De hecho, la funcionalidad es mayormente ortogonal a los </w:t>
+      </w:r>
+      <w:proofErr w:type="spellStart"/>
+      <w:r>
+        <w:rPr>
+          <w:rFonts w:ascii="Times New Roman" w:eastAsia="Times New Roman" w:hAnsi="Times New Roman" w:cs="Times New Roman"/>
+          <w:i/>
+          <w:color w:val="0000FF"/>
+          <w:sz w:val="20"/>
+          <w:szCs w:val="20"/>
+        </w:rPr>
+        <w:t>QAs</w:t>
+      </w:r>
+      <w:proofErr w:type="spellEnd"/>
+      <w:r>
+        <w:rPr>
+          <w:rFonts w:ascii="Times New Roman" w:eastAsia="Times New Roman" w:hAnsi="Times New Roman" w:cs="Times New Roman"/>
+          <w:i/>
+          <w:color w:val="0000FF"/>
+          <w:sz w:val="20"/>
+          <w:szCs w:val="20"/>
+        </w:rPr>
+        <w:t xml:space="preserve">; un diseño puede cumplir con la funcionalidad deseada y fallar a la hora de satisfacer sus requerimientos de calidad. De esta manera, se entiende a la funcionalidad como la capacidad del sistema para hacer el trabajo para el cual fue pensado, independientemente de la estructura. Existen QAs mayormente usados que se suelen identificar en numerosos sistemas y se tienen que describir, aunque la lista no es fina ya que muy a menudo hay situaciones en que podrían identificarse y proponerse nuevas propiedades para las diversas necesidades de </w:t>
+      </w:r>
+      <w:proofErr w:type="spellStart"/>
+      <w:r>
+        <w:rPr>
+          <w:rFonts w:ascii="Times New Roman" w:eastAsia="Times New Roman" w:hAnsi="Times New Roman" w:cs="Times New Roman"/>
+          <w:i/>
+          <w:color w:val="0000FF"/>
+          <w:sz w:val="20"/>
+          <w:szCs w:val="20"/>
+        </w:rPr>
+        <w:t>stakeholders</w:t>
+      </w:r>
+      <w:proofErr w:type="spellEnd"/>
+      <w:r>
+        <w:rPr>
+          <w:rFonts w:ascii="Times New Roman" w:eastAsia="Times New Roman" w:hAnsi="Times New Roman" w:cs="Times New Roman"/>
+          <w:i/>
+          <w:color w:val="0000FF"/>
+          <w:sz w:val="20"/>
+          <w:szCs w:val="20"/>
+        </w:rPr>
+        <w:t xml:space="preserve">.] </w:t>
       </w:r>
     </w:p>
     <w:p>
@@ -10234,11 +10793,19 @@
       <w:pPr>
         <w:ind w:left="705" w:firstLine="720"/>
       </w:pPr>
-      <w:r>
-        <w:rPr>
-          <w:rFonts w:ascii="Times New Roman" w:eastAsia="Times New Roman" w:hAnsi="Times New Roman" w:cs="Times New Roman"/>
-        </w:rPr>
-        <w:t>Login:</w:t>
+      <w:proofErr w:type="spellStart"/>
+      <w:r>
+        <w:rPr>
+          <w:rFonts w:ascii="Times New Roman" w:eastAsia="Times New Roman" w:hAnsi="Times New Roman" w:cs="Times New Roman"/>
+        </w:rPr>
+        <w:t>Login</w:t>
+      </w:r>
+      <w:proofErr w:type="spellEnd"/>
+      <w:r>
+        <w:rPr>
+          <w:rFonts w:ascii="Times New Roman" w:eastAsia="Times New Roman" w:hAnsi="Times New Roman" w:cs="Times New Roman"/>
+        </w:rPr>
+        <w:t>:</w:t>
       </w:r>
     </w:p>
     <w:p>
@@ -10474,7 +11041,61 @@
           <w:sz w:val="24"/>
           <w:szCs w:val="24"/>
         </w:rPr>
-        <w:t xml:space="preserve">Describe gráficamente cómo el usuario interactúa con el sistema para acceder a la interfaz de inicio de sesión, donde ingresa sus credenciales. El sistema valida esta información a través del controlador(AuthController) y la clase de acceso a datos de login (User), permitiendo el ingreso al sistema. </w:t>
+        <w:t>Describe gráficamente cómo el usuario interactúa con el sistema para acceder a la interfaz de inicio de sesión, donde ingresa sus credenciales. El sistema valida esta información a través del controlador(</w:t>
+      </w:r>
+      <w:proofErr w:type="spellStart"/>
+      <w:r>
+        <w:rPr>
+          <w:rFonts w:ascii="Times New Roman" w:eastAsia="Times New Roman" w:hAnsi="Times New Roman" w:cs="Times New Roman"/>
+          <w:sz w:val="24"/>
+          <w:szCs w:val="24"/>
+        </w:rPr>
+        <w:t>AuthController</w:t>
+      </w:r>
+      <w:proofErr w:type="spellEnd"/>
+      <w:r>
+        <w:rPr>
+          <w:rFonts w:ascii="Times New Roman" w:eastAsia="Times New Roman" w:hAnsi="Times New Roman" w:cs="Times New Roman"/>
+          <w:sz w:val="24"/>
+          <w:szCs w:val="24"/>
+        </w:rPr>
+        <w:t xml:space="preserve">) y la clase de acceso a datos de </w:t>
+      </w:r>
+      <w:proofErr w:type="spellStart"/>
+      <w:r>
+        <w:rPr>
+          <w:rFonts w:ascii="Times New Roman" w:eastAsia="Times New Roman" w:hAnsi="Times New Roman" w:cs="Times New Roman"/>
+          <w:sz w:val="24"/>
+          <w:szCs w:val="24"/>
+        </w:rPr>
+        <w:t>login</w:t>
+      </w:r>
+      <w:proofErr w:type="spellEnd"/>
+      <w:r>
+        <w:rPr>
+          <w:rFonts w:ascii="Times New Roman" w:eastAsia="Times New Roman" w:hAnsi="Times New Roman" w:cs="Times New Roman"/>
+          <w:sz w:val="24"/>
+          <w:szCs w:val="24"/>
+        </w:rPr>
+        <w:t xml:space="preserve"> (</w:t>
+      </w:r>
+      <w:proofErr w:type="spellStart"/>
+      <w:r>
+        <w:rPr>
+          <w:rFonts w:ascii="Times New Roman" w:eastAsia="Times New Roman" w:hAnsi="Times New Roman" w:cs="Times New Roman"/>
+          <w:sz w:val="24"/>
+          <w:szCs w:val="24"/>
+        </w:rPr>
+        <w:t>User</w:t>
+      </w:r>
+      <w:proofErr w:type="spellEnd"/>
+      <w:r>
+        <w:rPr>
+          <w:rFonts w:ascii="Times New Roman" w:eastAsia="Times New Roman" w:hAnsi="Times New Roman" w:cs="Times New Roman"/>
+          <w:sz w:val="24"/>
+          <w:szCs w:val="24"/>
+        </w:rPr>
+        <w:t xml:space="preserve">), permitiendo el ingreso al sistema. </w:t>
       </w:r>
     </w:p>
     <w:p>
@@ -10572,7 +11193,43 @@
           <w:sz w:val="24"/>
           <w:szCs w:val="24"/>
         </w:rPr>
-        <w:t xml:space="preserve">Describe gráficamente cómo el usuario interactúa con el sistema para registrase. El usuario accede a la interfaz de registro, la cual envía la información al controlador(AuthController), que a su vez gestiona la interacción con la clase de registro de usuarios(User). </w:t>
+        <w:t>Describe gráficamente cómo el usuario interactúa con el sistema para registrase. El usuario accede a la interfaz de registro, la cual envía la información al controlador(</w:t>
+      </w:r>
+      <w:proofErr w:type="spellStart"/>
+      <w:r>
+        <w:rPr>
+          <w:rFonts w:ascii="Times New Roman" w:eastAsia="Times New Roman" w:hAnsi="Times New Roman" w:cs="Times New Roman"/>
+          <w:sz w:val="24"/>
+          <w:szCs w:val="24"/>
+        </w:rPr>
+        <w:t>AuthController</w:t>
+      </w:r>
+      <w:proofErr w:type="spellEnd"/>
+      <w:r>
+        <w:rPr>
+          <w:rFonts w:ascii="Times New Roman" w:eastAsia="Times New Roman" w:hAnsi="Times New Roman" w:cs="Times New Roman"/>
+          <w:sz w:val="24"/>
+          <w:szCs w:val="24"/>
+        </w:rPr>
+        <w:t>), que a su vez gestiona la interacción con la clase de registro de usuarios(</w:t>
+      </w:r>
+      <w:proofErr w:type="spellStart"/>
+      <w:r>
+        <w:rPr>
+          <w:rFonts w:ascii="Times New Roman" w:eastAsia="Times New Roman" w:hAnsi="Times New Roman" w:cs="Times New Roman"/>
+          <w:sz w:val="24"/>
+          <w:szCs w:val="24"/>
+        </w:rPr>
+        <w:t>User</w:t>
+      </w:r>
+      <w:proofErr w:type="spellEnd"/>
+      <w:r>
+        <w:rPr>
+          <w:rFonts w:ascii="Times New Roman" w:eastAsia="Times New Roman" w:hAnsi="Times New Roman" w:cs="Times New Roman"/>
+          <w:sz w:val="24"/>
+          <w:szCs w:val="24"/>
+        </w:rPr>
+        <w:t xml:space="preserve">). </w:t>
       </w:r>
     </w:p>
     <w:p>
@@ -11596,14 +12253,10 @@
           <w:sz w:val="20"/>
           <w:szCs w:val="20"/>
         </w:rPr>
-        <w:t>[Los Atributos de Calidad (QAs) son propiedades medibles y evaluables de un sistema, estas propiedades son usadas para indicar el grado en que el sistema satisface las necesidades de los stakeholders   [Wojcik  2013].</w:t>
-      </w:r>
-    </w:p>
-    <w:p>
-      <w:pPr>
-        <w:spacing w:after="0" w:line="240" w:lineRule="auto"/>
-        <w:ind w:left="360"/>
-        <w:jc w:val="both"/>
+        <w:t>[Los Atributos de Calidad (</w:t>
+      </w:r>
+      <w:proofErr w:type="spellStart"/>
+      <w:r>
         <w:rPr>
           <w:rFonts w:ascii="Times New Roman" w:eastAsia="Times New Roman" w:hAnsi="Times New Roman" w:cs="Times New Roman"/>
           <w:i/>
@@ -11611,7 +12264,9 @@
           <w:sz w:val="20"/>
           <w:szCs w:val="20"/>
         </w:rPr>
-      </w:pPr>
+        <w:t>QAs</w:t>
+      </w:r>
+      <w:proofErr w:type="spellEnd"/>
       <w:r>
         <w:rPr>
           <w:rFonts w:ascii="Times New Roman" w:eastAsia="Times New Roman" w:hAnsi="Times New Roman" w:cs="Times New Roman"/>
@@ -11620,8 +12275,9 @@
           <w:sz w:val="20"/>
           <w:szCs w:val="20"/>
         </w:rPr>
-        <w:t xml:space="preserve">Los QAs además son concebidos como aquellos requerimientos que no son funcionales. De hecho, la funcionalidad es mayormente ortogonal a los QAs; un diseño puede cumplir con la funcionalidad deseada y fallar a la hora de satisfacer sus requerimientos de calidad. De esta manera, se entiende a la funcionalidad como la capacidad del sistema para hacer el trabajo para el cual fue pensado, </w:t>
-      </w:r>
+        <w:t xml:space="preserve">) son propiedades medibles y evaluables de un sistema, estas propiedades son usadas para indicar el grado en que el sistema satisface las necesidades de los </w:t>
+      </w:r>
+      <w:proofErr w:type="spellStart"/>
       <w:r>
         <w:rPr>
           <w:rFonts w:ascii="Times New Roman" w:eastAsia="Times New Roman" w:hAnsi="Times New Roman" w:cs="Times New Roman"/>
@@ -11630,8 +12286,141 @@
           <w:sz w:val="20"/>
           <w:szCs w:val="20"/>
         </w:rPr>
+        <w:t>stakeholders</w:t>
+      </w:r>
+      <w:proofErr w:type="spellEnd"/>
+      <w:r>
+        <w:rPr>
+          <w:rFonts w:ascii="Times New Roman" w:eastAsia="Times New Roman" w:hAnsi="Times New Roman" w:cs="Times New Roman"/>
+          <w:i/>
+          <w:color w:val="0000FF"/>
+          <w:sz w:val="20"/>
+          <w:szCs w:val="20"/>
+        </w:rPr>
+        <w:t xml:space="preserve">   [</w:t>
+      </w:r>
+      <w:proofErr w:type="spellStart"/>
+      <w:r>
+        <w:rPr>
+          <w:rFonts w:ascii="Times New Roman" w:eastAsia="Times New Roman" w:hAnsi="Times New Roman" w:cs="Times New Roman"/>
+          <w:i/>
+          <w:color w:val="0000FF"/>
+          <w:sz w:val="20"/>
+          <w:szCs w:val="20"/>
+        </w:rPr>
+        <w:t>Wojcik</w:t>
+      </w:r>
+      <w:proofErr w:type="spellEnd"/>
+      <w:r>
+        <w:rPr>
+          <w:rFonts w:ascii="Times New Roman" w:eastAsia="Times New Roman" w:hAnsi="Times New Roman" w:cs="Times New Roman"/>
+          <w:i/>
+          <w:color w:val="0000FF"/>
+          <w:sz w:val="20"/>
+          <w:szCs w:val="20"/>
+        </w:rPr>
+        <w:t xml:space="preserve">  2013].</w:t>
+      </w:r>
+    </w:p>
+    <w:p>
+      <w:pPr>
+        <w:spacing w:after="0" w:line="240" w:lineRule="auto"/>
+        <w:ind w:left="360"/>
+        <w:jc w:val="both"/>
+        <w:rPr>
+          <w:rFonts w:ascii="Times New Roman" w:eastAsia="Times New Roman" w:hAnsi="Times New Roman" w:cs="Times New Roman"/>
+          <w:i/>
+          <w:color w:val="0000FF"/>
+          <w:sz w:val="20"/>
+          <w:szCs w:val="20"/>
+        </w:rPr>
+      </w:pPr>
+      <w:r>
+        <w:rPr>
+          <w:rFonts w:ascii="Times New Roman" w:eastAsia="Times New Roman" w:hAnsi="Times New Roman" w:cs="Times New Roman"/>
+          <w:i/>
+          <w:color w:val="0000FF"/>
+          <w:sz w:val="20"/>
+          <w:szCs w:val="20"/>
+        </w:rPr>
+        <w:t xml:space="preserve">Los </w:t>
+      </w:r>
+      <w:proofErr w:type="spellStart"/>
+      <w:r>
+        <w:rPr>
+          <w:rFonts w:ascii="Times New Roman" w:eastAsia="Times New Roman" w:hAnsi="Times New Roman" w:cs="Times New Roman"/>
+          <w:i/>
+          <w:color w:val="0000FF"/>
+          <w:sz w:val="20"/>
+          <w:szCs w:val="20"/>
+        </w:rPr>
+        <w:t>QAs</w:t>
+      </w:r>
+      <w:proofErr w:type="spellEnd"/>
+      <w:r>
+        <w:rPr>
+          <w:rFonts w:ascii="Times New Roman" w:eastAsia="Times New Roman" w:hAnsi="Times New Roman" w:cs="Times New Roman"/>
+          <w:i/>
+          <w:color w:val="0000FF"/>
+          <w:sz w:val="20"/>
+          <w:szCs w:val="20"/>
+        </w:rPr>
+        <w:t xml:space="preserve"> además son concebidos como aquellos requerimientos que no son funcionales. De hecho, la funcionalidad es mayormente ortogonal a los </w:t>
+      </w:r>
+      <w:proofErr w:type="spellStart"/>
+      <w:r>
+        <w:rPr>
+          <w:rFonts w:ascii="Times New Roman" w:eastAsia="Times New Roman" w:hAnsi="Times New Roman" w:cs="Times New Roman"/>
+          <w:i/>
+          <w:color w:val="0000FF"/>
+          <w:sz w:val="20"/>
+          <w:szCs w:val="20"/>
+        </w:rPr>
+        <w:t>QAs</w:t>
+      </w:r>
+      <w:proofErr w:type="spellEnd"/>
+      <w:r>
+        <w:rPr>
+          <w:rFonts w:ascii="Times New Roman" w:eastAsia="Times New Roman" w:hAnsi="Times New Roman" w:cs="Times New Roman"/>
+          <w:i/>
+          <w:color w:val="0000FF"/>
+          <w:sz w:val="20"/>
+          <w:szCs w:val="20"/>
+        </w:rPr>
+        <w:t xml:space="preserve">; un diseño puede cumplir con la funcionalidad deseada y fallar a la hora de satisfacer sus requerimientos de calidad. De esta manera, se entiende a la funcionalidad como la capacidad del sistema para hacer el trabajo para el cual fue pensado, </w:t>
+      </w:r>
+      <w:r>
+        <w:rPr>
+          <w:rFonts w:ascii="Times New Roman" w:eastAsia="Times New Roman" w:hAnsi="Times New Roman" w:cs="Times New Roman"/>
+          <w:i/>
+          <w:color w:val="0000FF"/>
+          <w:sz w:val="20"/>
+          <w:szCs w:val="20"/>
+        </w:rPr>
         <w:lastRenderedPageBreak/>
-        <w:t xml:space="preserve">independientemente de la estructura. Existen QAs mayormente usados que se suelen identificar en numerosos sistemas y se tienen que describir, aunque la lista no es fina ya que muy a menudo hay situaciones en que podrían identificarse y proponerse nuevas propiedades para las diversas necesidades de stakeholders.] </w:t>
+        <w:t xml:space="preserve">independientemente de la estructura. Existen QAs mayormente usados que se suelen identificar en numerosos sistemas y se tienen que describir, aunque la lista no es fina ya que muy a menudo hay situaciones en que podrían identificarse y proponerse nuevas propiedades para las diversas necesidades de </w:t>
+      </w:r>
+      <w:proofErr w:type="spellStart"/>
+      <w:r>
+        <w:rPr>
+          <w:rFonts w:ascii="Times New Roman" w:eastAsia="Times New Roman" w:hAnsi="Times New Roman" w:cs="Times New Roman"/>
+          <w:i/>
+          <w:color w:val="0000FF"/>
+          <w:sz w:val="20"/>
+          <w:szCs w:val="20"/>
+        </w:rPr>
+        <w:t>stakeholders</w:t>
+      </w:r>
+      <w:proofErr w:type="spellEnd"/>
+      <w:r>
+        <w:rPr>
+          <w:rFonts w:ascii="Times New Roman" w:eastAsia="Times New Roman" w:hAnsi="Times New Roman" w:cs="Times New Roman"/>
+          <w:i/>
+          <w:color w:val="0000FF"/>
+          <w:sz w:val="20"/>
+          <w:szCs w:val="20"/>
+        </w:rPr>
+        <w:t xml:space="preserve">.] </w:t>
       </w:r>
     </w:p>
     <w:p>
@@ -11804,7 +12593,29 @@
           <w:sz w:val="20"/>
           <w:szCs w:val="20"/>
         </w:rPr>
-        <w:t>[Este atributo de calidad se refiere a la facilidad con la que un usuario puede aprender a utilizar e interpretar los resultados producidos por un sistema [Barbacci 1995]. Para este atributo de calidad, se suelen considerar diversos aspectos de la interacción humano computadora, tales como: aprendizaje del sistema, utilización eficiente del sistema, minimización del impacto de errores, adaptación del sistema a las necesidades del usuario, confianza y satisfacción, entre otros.]</w:t>
+        <w:t>[Este atributo de calidad se refiere a la facilidad con la que un usuario puede aprender a utilizar e interpretar los resultados producidos por un sistema [</w:t>
+      </w:r>
+      <w:proofErr w:type="spellStart"/>
+      <w:r>
+        <w:rPr>
+          <w:rFonts w:ascii="Times New Roman" w:eastAsia="Times New Roman" w:hAnsi="Times New Roman" w:cs="Times New Roman"/>
+          <w:i/>
+          <w:color w:val="0000FF"/>
+          <w:sz w:val="20"/>
+          <w:szCs w:val="20"/>
+        </w:rPr>
+        <w:t>Barbacci</w:t>
+      </w:r>
+      <w:proofErr w:type="spellEnd"/>
+      <w:r>
+        <w:rPr>
+          <w:rFonts w:ascii="Times New Roman" w:eastAsia="Times New Roman" w:hAnsi="Times New Roman" w:cs="Times New Roman"/>
+          <w:i/>
+          <w:color w:val="0000FF"/>
+          <w:sz w:val="20"/>
+          <w:szCs w:val="20"/>
+        </w:rPr>
+        <w:t xml:space="preserve"> 1995]. Para este atributo de calidad, se suelen considerar diversos aspectos de la interacción humano computadora, tales como: aprendizaje del sistema, utilización eficiente del sistema, minimización del impacto de errores, adaptación del sistema a las necesidades del usuario, confianza y satisfacción, entre otros.]</w:t>
       </w:r>
     </w:p>
     <w:p>
@@ -11873,7 +12684,29 @@
           <w:sz w:val="20"/>
           <w:szCs w:val="20"/>
         </w:rPr>
-        <w:t>[Es el equilibrio entre la confidencialidad, la integridad, la irrefutabilidad y la disponibilidad de la información y datos manipulados por el sistema. Se trata del estado de un sistema, el cual puede ser transitorio y volátil. La seguridad de un sistema se caracteriza por mecanismos y técnicas empleados para intentar reducir los más posible el impacto provocado por un ataque, y las amenazas (entendidas como los caminos mediante los cuales se pueden provocar un ataque).</w:t>
+        <w:t xml:space="preserve">[Es el equilibrio entre la confidencialidad, la integridad, la </w:t>
+      </w:r>
+      <w:proofErr w:type="spellStart"/>
+      <w:r>
+        <w:rPr>
+          <w:rFonts w:ascii="Times New Roman" w:eastAsia="Times New Roman" w:hAnsi="Times New Roman" w:cs="Times New Roman"/>
+          <w:i/>
+          <w:color w:val="0000FF"/>
+          <w:sz w:val="20"/>
+          <w:szCs w:val="20"/>
+        </w:rPr>
+        <w:t>irrefutabilidad</w:t>
+      </w:r>
+      <w:proofErr w:type="spellEnd"/>
+      <w:r>
+        <w:rPr>
+          <w:rFonts w:ascii="Times New Roman" w:eastAsia="Times New Roman" w:hAnsi="Times New Roman" w:cs="Times New Roman"/>
+          <w:i/>
+          <w:color w:val="0000FF"/>
+          <w:sz w:val="20"/>
+          <w:szCs w:val="20"/>
+        </w:rPr>
+        <w:t xml:space="preserve"> y la disponibilidad de la información y datos manipulados por el sistema. Se trata del estado de un sistema, el cual puede ser transitorio y volátil. La seguridad de un sistema se caracteriza por mecanismos y técnicas empleados para intentar reducir los más posible el impacto provocado por un ataque, y las amenazas (entendidas como los caminos mediante los cuales se pueden provocar un ataque).</w:t>
       </w:r>
     </w:p>
     <w:p>

</xml_diff>

<commit_message>
Implementacion de correccion en FD04
</commit_message>
<xml_diff>
--- a/Documents/FD04-EPIS-Informe Arquitectura de Software.docx
+++ b/Documents/FD04-EPIS-Informe Arquitectura de Software.docx
@@ -949,6 +949,14 @@
                 <w:szCs w:val="18"/>
               </w:rPr>
               <w:t>AHAO, CDAR, WESJ</w:t>
+            </w:r>
+            <w:r>
+              <w:rPr>
+                <w:rFonts w:ascii="Times New Roman" w:eastAsia="Times New Roman" w:hAnsi="Times New Roman" w:cs="Times New Roman"/>
+                <w:sz w:val="18"/>
+                <w:szCs w:val="18"/>
+              </w:rPr>
+              <w:t>, BEAS</w:t>
             </w:r>
           </w:p>
         </w:tc>

</xml_diff>